<commit_message>
v35: watermarks-remover clean (strip customXml)
</commit_message>
<xml_diff>
--- a/manuscript_v35.docx
+++ b/manuscript_v35.docx
@@ -14768,16 +14768,4 @@
   </a:objectDefaults>
   <a:extraClrSchemeLst/>
 </a:theme>
-</file>
-
-<file path=customXml/item1.xml><?xml version="1.0" encoding="utf-8"?>
-<b:Sources xmlns:b="http://schemas.openxmlformats.org/officeDocument/2006/bibliography" xmlns="http://schemas.openxmlformats.org/officeDocument/2006/bibliography" SelectedStyle="/APA.XSL" StyleName="APA"/>
-</file>
-
-<file path=customXml/itemProps1.xml><?xml version="1.0" encoding="utf-8"?>
-<ds:datastoreItem xmlns:ds="http://schemas.openxmlformats.org/officeDocument/2006/customXml" ds:itemID="{CBC531A2-3200-6A4A-9635-22648ADE5314}">
-  <ds:schemaRefs>
-    <ds:schemaRef ds:uri="http://schemas.openxmlformats.org/officeDocument/2006/bibliography"/>
-  </ds:schemaRefs>
-</ds:datastoreItem>
 </file>
</xml_diff>

<commit_message>
v35 figure-lock fixes: manuscript_v35.docx
</commit_message>
<xml_diff>
--- a/manuscript_v35.docx
+++ b/manuscript_v35.docx
@@ -1101,7 +1101,7 @@
         </w:rPr>
       </w:pPr>
       <w:r>
-        <w:t xml:space="preserve">Eight operational endpoints were evaluated, of which six were treated as primary evaluation endpoints. E1 was PDAC-wide dependency, defined from DepMap 23Q2 Chronos gene effect in pancreatic cell lines below the essentiality threshold 1–2 (4,584 positives). E2 was PDAC-enriched dependency, defined as the upper quartile of a PDAC-versus-other selectivity statistic among E1 positives (1,147 positives); because it is nested within E1, it was not counted as a primary endpoint. E3 was an essential-and-druggable construct, defined as E1 positivity plus an annotated druggability label (1,159 positives). E3-A removed the druggability conjunct from E3 and therefore reproduced the E1 positive set exactly (4,584 positives); it was retained for continuity but not counted independently. E3-C used the chemical-tractability layer directly as the label (5,188 positives) and served as a circular control. E4 was colorectal cancer zero-shot transfer: the PDAC scoring functions were applied without refitting to DepMap 23Q2 colorectal lines (4,608 positives). E5 measured historical concordance with the nominal primary targets of agents entering pancreatic-cancer clinical development (35 positives). E6 was a pharmacological-response proxy based on Genomics of Drug Sensitivity in Cancer (GDSC): among 125 compounds with annotated targets, a gene was positive when it was the nominal target of a compound in the most sensitive </w:t>
+        <w:t xml:space="preserve">Eight operational endpoints were evaluated, of which six were treated as primary evaluation endpoints. E1 was PDAC-wide dependency, defined from DepMap 23Q2 Chronos gene effect in pancreatic cell lines below the essentiality threshold 1–2 (4,584 positives). E2 was PDAC-enriched dependency, defined as the upper quartile of a PDAC-versus-other selectivity statistic among E1 positives (1,147 positives); because it is nested within E1, it was not counted as a primary endpoint. E3 was an essential-and-druggable construct, defined as E1 positivity plus an annotated druggability label (1,159 positives). E3-A removed the druggability conjunct from E3 and therefore reproduced the E1 positive set exactly (4,584 positives); it was retained for continuity but not counted independently. E3-C used the chemical-tractability layer directly as the label (5,188 positives) and served as a circular control. E4 was colorectal cancer zero-shot transfer: the PDAC scoring functions were applied without refitting to DepMap 23Q2 colorectal lines (4,608 positives). E5 measured historical concordance with the nominal primary targets of agents entering pancreatic-cancer clinical development (35 positives). E6 was a pharmacological-response proxy based on Genomics of Drug Sensitivity in Cancer (GDSC): among 125 compounds with annotated targets, 41 fell in the most sensitive </w:t>
       </w:r>
       <w:proofErr w:type="spellStart"/>
       <w:r>
@@ -1109,7 +1109,7 @@
       </w:r>
       <w:proofErr w:type="spellEnd"/>
       <w:r>
-        <w:t xml:space="preserve"> across 29 pancreatic cell lines and not in the most resistant </w:t>
+        <w:t xml:space="preserve">, and a gene was positive when it was the nominal target of one of those compounds across 29 pancreatic cell lines and not in the most resistant </w:t>
       </w:r>
       <w:proofErr w:type="spellStart"/>
       <w:r>
@@ -1316,11 +1316,23 @@
           <w:rFonts w:ascii="Arial" w:hAnsi="Arial"/>
           <w:sz w:val="19"/>
         </w:rPr>
-        <w:t>The implementation-specific weights and rank normalization for weighted rank aggregation were defined in the released analysis code and are reported in Supplementary Table 5; no additional weighting formula is specified here beyond the prespecified driver and support components above.</w:t>
+        <w:t xml:space="preserve">A geometric mean was evaluated as an additional sensitivity analysis and was not included among the 13 benchmark scorers.</w:t>
       </w:r>
     </w:p>
     <w:p>
       <w:pPr>
+        <w:spacing w:after="120"/>
+      </w:pPr>
+      <w:r>
+        <w:rPr>
+          <w:rFonts w:ascii="Arial" w:hAnsi="Arial"/>
+          <w:sz w:val="19"/>
+        </w:rPr>
+        <w:t>The implementation-specific weights and rank normalization for weighted rank aggregation were defined in the released analysis code and are reported in Supplementary Table 5; no additional weighting formula is specified here beyond the prespecified driver and support components above.</w:t>
+      </w:r>
+    </w:p>
+    <w:p>
+      <w:pPr>
         <w:spacing w:after="100"/>
       </w:pPr>
       <w:r>
@@ -1404,7 +1416,7 @@
         <w:rPr>
           <w:color w:val="000000" w:themeColor="text1"/>
         </w:rPr>
-        <w:t>All numerical claims were recomputed from the released analysis pipeline. The audit ledger in Supplementary Table 1 records the provenance of each finding. The harmonic composite reproduced AUROCs of 0.893 on E3, 0.575 on E1 and 0.941 on historical clinical-target concordance. A clean rerun from the released inputs reproduced all 104 scorer-endpoint benchmark cells to six decimals, with a maximum absolute difference of 0.0, together with confidence intervals, negative controls, functional-form analyses and the full 1,000-draw Dirichlet weight-space analysis. The run record is identified by git commit SHA 0d000c31ebc56ed7308c75d4bc4b51328cae2aa2 and results-manifest SHA-256 58918c162107f163910d9179fe676855b0df7a1a5837c166321cc968b4bf963a.</w:t>
+        <w:t>All numerical claims were recomputed from the released analysis pipeline. The audit ledger in Supplementary Table 1 records the provenance of each finding. The harmonic composite reproduced AUROCs of 0.893 on E3, 0.575 on E1 and 0.941 on historical clinical-target concordance. A clean rerun from the released inputs reproduced all 104 scorer-endpoint benchmark cells to six decimals, with a maximum absolute difference of 0.0, together with confidence intervals, negative controls, functional-form analyses and the full 1,000-draw Dirichlet weight-space analysis. The run record is identified by git commit SHA 1d9dba72e46f4459f28a2ba1368e820be8d30c3b and results-manifest SHA-256 675a3d6a6e4f0385a2fd652e847d69b8ee1ec779f1ddbe5f014ca3b3eb48d2d4.</w:t>
       </w:r>
     </w:p>
     <w:p>

</xml_diff>

<commit_message>
v35: fill author metadata (5 authors + COI + funding + CRediT)
</commit_message>
<xml_diff>
--- a/manuscript_v35.docx
+++ b/manuscript_v35.docx
@@ -29,7 +29,141 @@
         <w:rPr>
           <w:color w:val="000000" w:themeColor="text1"/>
         </w:rPr>
-        <w:t>[Author names and affiliations]</w:t>
+        <w:t>Xianbo Zuo1,2,*, Jingtao Li2,3,†, Xuejiao Song1,2,†, Xiaoyan Qi4,5, Lili Chen6</w:t>
+      </w:r>
+    </w:p>
+    <w:p>
+      <w:pPr>
+        <w:jc w:val="center"/>
+        <w:rPr>
+          <w:rFonts w:ascii="Arial" w:hAnsi="Arial"/>
+          <w:sz w:val="16"/>
+          <w:szCs w:val="16"/>
+          <w:color w:val="000000"/>
+        </w:rPr>
+      </w:pPr>
+      <w:r>
+        <w:rPr>
+          <w:rFonts w:ascii="Arial" w:hAnsi="Arial"/>
+          <w:sz w:val="16"/>
+          <w:szCs w:val="16"/>
+          <w:color w:val="000000"/>
+        </w:rPr>
+        <w:t>†These authors contributed equally: Jingtao Li, Xuejiao Song. *Correspondence: Xianbo Zuo (zuoxianbo@qq.com).</w:t>
+      </w:r>
+    </w:p>
+    <w:p>
+      <w:pPr>
+        <w:rPr>
+          <w:rFonts w:ascii="Arial" w:hAnsi="Arial"/>
+          <w:sz w:val="16"/>
+          <w:szCs w:val="16"/>
+          <w:color w:val="000000"/>
+        </w:rPr>
+      </w:pPr>
+      <w:r>
+        <w:rPr>
+          <w:rFonts w:ascii="Arial" w:hAnsi="Arial"/>
+          <w:sz w:val="16"/>
+          <w:szCs w:val="16"/>
+          <w:color w:val="000000"/>
+        </w:rPr>
+        <w:t>1 Big Data Center, China-Japan Friendship Hospital, Beijing 100029, China.</w:t>
+      </w:r>
+    </w:p>
+    <w:p>
+      <w:pPr>
+        <w:rPr>
+          <w:rFonts w:ascii="Arial" w:hAnsi="Arial"/>
+          <w:sz w:val="16"/>
+          <w:szCs w:val="16"/>
+          <w:color w:val="000000"/>
+        </w:rPr>
+      </w:pPr>
+      <w:r>
+        <w:rPr>
+          <w:rFonts w:ascii="Arial" w:hAnsi="Arial"/>
+          <w:sz w:val="16"/>
+          <w:szCs w:val="16"/>
+          <w:color w:val="000000"/>
+        </w:rPr>
+        <w:t>2 NHC Key Laboratory of Clinical Big Data Standardization &amp; Integration, Beijing 100029, China.</w:t>
+      </w:r>
+    </w:p>
+    <w:p>
+      <w:pPr>
+        <w:rPr>
+          <w:rFonts w:ascii="Arial" w:hAnsi="Arial"/>
+          <w:sz w:val="16"/>
+          <w:szCs w:val="16"/>
+          <w:color w:val="000000"/>
+        </w:rPr>
+      </w:pPr>
+      <w:r>
+        <w:rPr>
+          <w:rFonts w:ascii="Arial" w:hAnsi="Arial"/>
+          <w:sz w:val="16"/>
+          <w:szCs w:val="16"/>
+          <w:color w:val="000000"/>
+        </w:rPr>
+        <w:t>3 Department of Gastroenterology, China-Japan Friendship Hospital, Beijing 100029, China.</w:t>
+      </w:r>
+    </w:p>
+    <w:p>
+      <w:pPr>
+        <w:rPr>
+          <w:rFonts w:ascii="Arial" w:hAnsi="Arial"/>
+          <w:sz w:val="16"/>
+          <w:szCs w:val="16"/>
+          <w:color w:val="000000"/>
+        </w:rPr>
+      </w:pPr>
+      <w:r>
+        <w:rPr>
+          <w:rFonts w:ascii="Arial" w:hAnsi="Arial"/>
+          <w:sz w:val="16"/>
+          <w:szCs w:val="16"/>
+          <w:color w:val="000000"/>
+        </w:rPr>
+        <w:t>4 Chinese Academy of Medical Sciences &amp; Peking Union Medical College, Beijing 100730, China.</w:t>
+      </w:r>
+    </w:p>
+    <w:p>
+      <w:pPr>
+        <w:rPr>
+          <w:rFonts w:ascii="Arial" w:hAnsi="Arial"/>
+          <w:sz w:val="16"/>
+          <w:szCs w:val="16"/>
+          <w:color w:val="000000"/>
+        </w:rPr>
+      </w:pPr>
+      <w:r>
+        <w:rPr>
+          <w:rFonts w:ascii="Arial" w:hAnsi="Arial"/>
+          <w:sz w:val="16"/>
+          <w:szCs w:val="16"/>
+          <w:color w:val="000000"/>
+        </w:rPr>
+        <w:t>5 China-Japan Friendship Hospital, Beijing 100029, China.</w:t>
+      </w:r>
+    </w:p>
+    <w:p>
+      <w:pPr>
+        <w:rPr>
+          <w:rFonts w:ascii="Arial" w:hAnsi="Arial"/>
+          <w:sz w:val="16"/>
+          <w:szCs w:val="16"/>
+          <w:color w:val="000000"/>
+        </w:rPr>
+      </w:pPr>
+      <w:r>
+        <w:rPr>
+          <w:rFonts w:ascii="Arial" w:hAnsi="Arial"/>
+          <w:sz w:val="16"/>
+          <w:szCs w:val="16"/>
+          <w:color w:val="000000"/>
+        </w:rPr>
+        <w:t>6 China-Japan Friendship Institute for Clinical Medicine, China-Japan Friendship Hospital, Beijing 100029, China.</w:t>
       </w:r>
     </w:p>
     <w:p>
@@ -1544,7 +1678,7 @@
         <w:rPr>
           <w:color w:val="000000" w:themeColor="text1"/>
         </w:rPr>
-        <w:t>[TO COMPLETE: The authors declare no competing interests / or provide the full disclosure required by Nature Portfolio.]</w:t>
+        <w:t>The authors declare no competing interests.</w:t>
       </w:r>
     </w:p>
     <w:p>
@@ -1571,7 +1705,7 @@
         <w:rPr>
           <w:color w:val="000000" w:themeColor="text1"/>
         </w:rPr>
-        <w:t>[TO COMPLETE: State all funding sources and the role of each funder, or state that no specific funding was received.]</w:t>
+        <w:t>This work was supported by the National Key R&amp;D Program of China (2024YFF0507404) and the China-Japan Friendship Hospital Horizontal Project (2024-HX-JC-17).</w:t>
       </w:r>
     </w:p>
     <w:p>
@@ -1598,7 +1732,7 @@
         <w:rPr>
           <w:color w:val="000000" w:themeColor="text1"/>
         </w:rPr>
-        <w:t>[TO COMPLETE: Provide author-specific contributions using a standard contribution taxonomy or equivalent.]</w:t>
+        <w:t>X.Z., J.L. and X.S. conceived the study. J.L., X.S. and X.Z. designed the methodology. X.Z. developed the analysis software. J.L. and X.S. performed the formal analyses. J.L., X.S., X.Q. and L.C. validated the results. X.Z. acquired funding. All authors reviewed and approved the final manuscript.</w:t>
       </w:r>
     </w:p>
     <w:p>

</xml_diff>

<commit_message>
v35: anonymize author block + contributions for public repo
</commit_message>
<xml_diff>
--- a/manuscript_v35.docx
+++ b/manuscript_v35.docx
@@ -29,141 +29,7 @@
         <w:rPr>
           <w:color w:val="000000" w:themeColor="text1"/>
         </w:rPr>
-        <w:t>Xianbo Zuo1,2,*, Jingtao Li2,3,†, Xuejiao Song1,2,†, Xiaoyan Qi4,5, Lili Chen6</w:t>
-      </w:r>
-    </w:p>
-    <w:p>
-      <w:pPr>
-        <w:jc w:val="center"/>
-        <w:rPr>
-          <w:rFonts w:ascii="Arial" w:hAnsi="Arial"/>
-          <w:sz w:val="16"/>
-          <w:szCs w:val="16"/>
-          <w:color w:val="000000"/>
-        </w:rPr>
-      </w:pPr>
-      <w:r>
-        <w:rPr>
-          <w:rFonts w:ascii="Arial" w:hAnsi="Arial"/>
-          <w:sz w:val="16"/>
-          <w:szCs w:val="16"/>
-          <w:color w:val="000000"/>
-        </w:rPr>
-        <w:t>†These authors contributed equally: Jingtao Li, Xuejiao Song. *Correspondence: Xianbo Zuo (zuoxianbo@qq.com).</w:t>
-      </w:r>
-    </w:p>
-    <w:p>
-      <w:pPr>
-        <w:rPr>
-          <w:rFonts w:ascii="Arial" w:hAnsi="Arial"/>
-          <w:sz w:val="16"/>
-          <w:szCs w:val="16"/>
-          <w:color w:val="000000"/>
-        </w:rPr>
-      </w:pPr>
-      <w:r>
-        <w:rPr>
-          <w:rFonts w:ascii="Arial" w:hAnsi="Arial"/>
-          <w:sz w:val="16"/>
-          <w:szCs w:val="16"/>
-          <w:color w:val="000000"/>
-        </w:rPr>
-        <w:t>1 Big Data Center, China-Japan Friendship Hospital, Beijing 100029, China.</w:t>
-      </w:r>
-    </w:p>
-    <w:p>
-      <w:pPr>
-        <w:rPr>
-          <w:rFonts w:ascii="Arial" w:hAnsi="Arial"/>
-          <w:sz w:val="16"/>
-          <w:szCs w:val="16"/>
-          <w:color w:val="000000"/>
-        </w:rPr>
-      </w:pPr>
-      <w:r>
-        <w:rPr>
-          <w:rFonts w:ascii="Arial" w:hAnsi="Arial"/>
-          <w:sz w:val="16"/>
-          <w:szCs w:val="16"/>
-          <w:color w:val="000000"/>
-        </w:rPr>
-        <w:t>2 NHC Key Laboratory of Clinical Big Data Standardization &amp; Integration, Beijing 100029, China.</w:t>
-      </w:r>
-    </w:p>
-    <w:p>
-      <w:pPr>
-        <w:rPr>
-          <w:rFonts w:ascii="Arial" w:hAnsi="Arial"/>
-          <w:sz w:val="16"/>
-          <w:szCs w:val="16"/>
-          <w:color w:val="000000"/>
-        </w:rPr>
-      </w:pPr>
-      <w:r>
-        <w:rPr>
-          <w:rFonts w:ascii="Arial" w:hAnsi="Arial"/>
-          <w:sz w:val="16"/>
-          <w:szCs w:val="16"/>
-          <w:color w:val="000000"/>
-        </w:rPr>
-        <w:t>3 Department of Gastroenterology, China-Japan Friendship Hospital, Beijing 100029, China.</w:t>
-      </w:r>
-    </w:p>
-    <w:p>
-      <w:pPr>
-        <w:rPr>
-          <w:rFonts w:ascii="Arial" w:hAnsi="Arial"/>
-          <w:sz w:val="16"/>
-          <w:szCs w:val="16"/>
-          <w:color w:val="000000"/>
-        </w:rPr>
-      </w:pPr>
-      <w:r>
-        <w:rPr>
-          <w:rFonts w:ascii="Arial" w:hAnsi="Arial"/>
-          <w:sz w:val="16"/>
-          <w:szCs w:val="16"/>
-          <w:color w:val="000000"/>
-        </w:rPr>
-        <w:t>4 Chinese Academy of Medical Sciences &amp; Peking Union Medical College, Beijing 100730, China.</w:t>
-      </w:r>
-    </w:p>
-    <w:p>
-      <w:pPr>
-        <w:rPr>
-          <w:rFonts w:ascii="Arial" w:hAnsi="Arial"/>
-          <w:sz w:val="16"/>
-          <w:szCs w:val="16"/>
-          <w:color w:val="000000"/>
-        </w:rPr>
-      </w:pPr>
-      <w:r>
-        <w:rPr>
-          <w:rFonts w:ascii="Arial" w:hAnsi="Arial"/>
-          <w:sz w:val="16"/>
-          <w:szCs w:val="16"/>
-          <w:color w:val="000000"/>
-        </w:rPr>
-        <w:t>5 China-Japan Friendship Hospital, Beijing 100029, China.</w:t>
-      </w:r>
-    </w:p>
-    <w:p>
-      <w:pPr>
-        <w:rPr>
-          <w:rFonts w:ascii="Arial" w:hAnsi="Arial"/>
-          <w:sz w:val="16"/>
-          <w:szCs w:val="16"/>
-          <w:color w:val="000000"/>
-        </w:rPr>
-      </w:pPr>
-      <w:r>
-        <w:rPr>
-          <w:rFonts w:ascii="Arial" w:hAnsi="Arial"/>
-          <w:sz w:val="16"/>
-          <w:szCs w:val="16"/>
-          <w:color w:val="000000"/>
-        </w:rPr>
-        <w:t>6 China-Japan Friendship Institute for Clinical Medicine, China-Japan Friendship Hospital, Beijing 100029, China.</w:t>
+        <w:t>[Author names and affiliations]</w:t>
       </w:r>
     </w:p>
     <w:p>
@@ -1732,7 +1598,7 @@
         <w:rPr>
           <w:color w:val="000000" w:themeColor="text1"/>
         </w:rPr>
-        <w:t>X.Z., J.L. and X.S. conceived the study. J.L., X.S. and X.Z. designed the methodology. X.Z. developed the analysis software. J.L. and X.S. performed the formal analyses. J.L., X.S., X.Q. and L.C. validated the results. X.Z. acquired funding. All authors reviewed and approved the final manuscript.</w:t>
+        <w:t>[TO COMPLETE: Provide author-specific contributions using a standard contribution taxonomy or equivalent.]</w:t>
       </w:r>
     </w:p>
     <w:p>

</xml_diff>

<commit_message>
v35: blank out author block + contributions + funding for public repo
</commit_message>
<xml_diff>
--- a/manuscript_v35.docx
+++ b/manuscript_v35.docx
@@ -16,20 +16,6 @@
           <w:sz w:val="38"/>
         </w:rPr>
         <w:t>Auditing when evidence integration improves therapeutic target prioritization</w:t>
-      </w:r>
-    </w:p>
-    <w:p>
-      <w:pPr>
-        <w:jc w:val="center"/>
-        <w:rPr>
-          <w:color w:val="000000" w:themeColor="text1"/>
-        </w:rPr>
-      </w:pPr>
-      <w:r>
-        <w:rPr>
-          <w:color w:val="000000" w:themeColor="text1"/>
-        </w:rPr>
-        <w:t>[Author names and affiliations]</w:t>
       </w:r>
     </w:p>
     <w:p>
@@ -1571,7 +1557,7 @@
         <w:rPr>
           <w:color w:val="000000" w:themeColor="text1"/>
         </w:rPr>
-        <w:t>This work was supported by the National Key R&amp;D Program of China (2024YFF0507404) and the China-Japan Friendship Hospital Horizontal Project (2024-HX-JC-17).</w:t>
+        <w:t/>
       </w:r>
     </w:p>
     <w:p>
@@ -1598,7 +1584,7 @@
         <w:rPr>
           <w:color w:val="000000" w:themeColor="text1"/>
         </w:rPr>
-        <w:t>[TO COMPLETE: Provide author-specific contributions using a standard contribution taxonomy or equivalent.]</w:t>
+        <w:t/>
       </w:r>
     </w:p>
     <w:p>

</xml_diff>

<commit_message>
v35 Fig6 fix: nine scorers caption
</commit_message>
<xml_diff>
--- a/manuscript_v35.docx
+++ b/manuscript_v35.docx
@@ -1402,7 +1402,7 @@
         <w:rPr>
           <w:color w:val="000000" w:themeColor="text1"/>
         </w:rPr>
-        <w:t>All numerical claims were recomputed from the released analysis pipeline. The audit ledger in Supplementary Table 1 records the provenance of each finding. The harmonic composite reproduced AUROCs of 0.893 on E3, 0.575 on E1 and 0.941 on historical clinical-target concordance. A clean rerun from the released inputs reproduced all 104 scorer-endpoint benchmark cells to six decimals, with a maximum absolute difference of 0.0, together with confidence intervals, negative controls, functional-form analyses and the full 1,000-draw Dirichlet weight-space analysis. The run record is identified by git commit SHA 1d9dba72e46f4459f28a2ba1368e820be8d30c3b and results-manifest SHA-256 675a3d6a6e4f0385a2fd652e847d69b8ee1ec779f1ddbe5f014ca3b3eb48d2d4.</w:t>
+        <w:t>All numerical claims were recomputed from the released analysis pipeline. The audit ledger in Supplementary Table 1 records the provenance of each finding. The harmonic composite reproduced AUROCs of 0.893 on E3, 0.575 on E1 and 0.941 on historical clinical-target concordance. A clean rerun from the released inputs reproduced all 104 scorer-endpoint benchmark cells to six decimals, with a maximum absolute difference of 0.0, together with confidence intervals, negative controls, functional-form analyses and the full 1,000-draw Dirichlet weight-space analysis. The run record is identified by git commit SHA 5eb8a48cfade7def159eac0c2dd7f8010613827b and results-manifest SHA-256 1b9a1b6db0032ead15e0865a90e4b258127b7cbdb93dc4d33ce16e5614c911a8.</w:t>
       </w:r>
     </w:p>
     <w:p>
@@ -2149,7 +2149,7 @@
         <w:rPr>
           <w:color w:val="000000" w:themeColor="text1"/>
         </w:rPr>
-        <w:t>a, Construction of the E6 pharmacological-response proxy and nominal-target attribution. b, AUROC comparison for all evaluated scorers on E6. The nine candidate genes are treated as prospective computational hypotheses and are shown in Extended Data Fig. 4.</w:t>
+        <w:t>a, Construction of the E6 pharmacological-response proxy and nominal-target attribution. b, AUROC for the nine scorers shown on E6. The nine candidate genes are treated as prospective computational hypotheses and are shown in Extended Data Fig. 4.</w:t>
       </w:r>
     </w:p>
     <w:p>

</xml_diff>